<commit_message>
Update app guide with shipped features + drop tracked Word lock
Add Voice practice, Interview-Day Countdown, and Readiness Trajectory rows
to the feature table (cloned row formatting) + mic/interview-date mentions in
the walkthrough. Defer display-name & conversation-history (not shipped yet).
Also stop tracking the stray Word ~$ lock file and gitignore Word temp +
_SEBELUM_ backups.

Co-Authored-By: Claude Opus 4.8 <noreply@anthropic.com>
</commit_message>
<xml_diff>
--- a/docs/Talkly-Panduan-Aplikasi.docx
+++ b/docs/Talkly-Panduan-Aplikasi.docx
@@ -594,6 +594,168 @@
           </w:p>
         </w:tc>
       </w:tr>
+      <w:tr>
+        <w:tc>
+          <w:tcPr>
+            <w:tcW w:type="dxa" w:w="2600"/>
+            <w:tcBorders>
+              <w:top w:val="single" w:color="DDD8F0" w:sz="1"/>
+              <w:left w:val="single" w:color="DDD8F0" w:sz="1"/>
+              <w:bottom w:val="single" w:color="DDD8F0" w:sz="1"/>
+              <w:right w:val="single" w:color="DDD8F0" w:sz="1"/>
+            </w:tcBorders>
+            <w:tcMar>
+              <w:top w:type="dxa" w:w="100"/>
+              <w:left w:type="dxa" w:w="140"/>
+              <w:bottom w:type="dxa" w:w="100"/>
+              <w:right w:type="dxa" w:w="140"/>
+            </w:tcMar>
+          </w:tcPr>
+          <w:p>
+            <w:r>
+              <w:rPr>
+                <w:b/>
+                <w:bCs/>
+              </w:rPr>
+              <w:t>Latihan Suara</w:t>
+            </w:r>
+          </w:p>
+        </w:tc>
+        <w:tc>
+          <w:tcPr>
+            <w:tcW w:type="dxa" w:w="6426"/>
+            <w:tcBorders>
+              <w:top w:val="single" w:color="DDD8F0" w:sz="1"/>
+              <w:left w:val="single" w:color="DDD8F0" w:sz="1"/>
+              <w:bottom w:val="single" w:color="DDD8F0" w:sz="1"/>
+              <w:right w:val="single" w:color="DDD8F0" w:sz="1"/>
+            </w:tcBorders>
+            <w:tcMar>
+              <w:top w:type="dxa" w:w="100"/>
+              <w:left w:type="dxa" w:w="140"/>
+              <w:bottom w:type="dxa" w:w="100"/>
+              <w:right w:type="dxa" w:w="140"/>
+            </w:tcMar>
+          </w:tcPr>
+          <w:p>
+            <w:r>
+              <w:rPr>
+                <w:b w:val="false"/>
+                <w:bCs w:val="false"/>
+              </w:rPr>
+              <w:t>Jawab pakai suara, bukan cuma ketik: rekam jawabanmu dan Talkly mengubahnya jadi teks untuk dikoreksi. Kamu juga bisa mendengar ucapan AI lewat tombol Dengar.</w:t>
+            </w:r>
+          </w:p>
+        </w:tc>
+      </w:tr>
+      <w:tr>
+        <w:tc>
+          <w:tcPr>
+            <w:tcW w:type="dxa" w:w="2600"/>
+            <w:tcBorders>
+              <w:top w:val="single" w:color="DDD8F0" w:sz="1"/>
+              <w:left w:val="single" w:color="DDD8F0" w:sz="1"/>
+              <w:bottom w:val="single" w:color="DDD8F0" w:sz="1"/>
+              <w:right w:val="single" w:color="DDD8F0" w:sz="1"/>
+            </w:tcBorders>
+            <w:tcMar>
+              <w:top w:type="dxa" w:w="100"/>
+              <w:left w:type="dxa" w:w="140"/>
+              <w:bottom w:type="dxa" w:w="100"/>
+              <w:right w:type="dxa" w:w="140"/>
+            </w:tcMar>
+          </w:tcPr>
+          <w:p>
+            <w:r>
+              <w:rPr>
+                <w:b/>
+                <w:bCs/>
+              </w:rPr>
+              <w:t>Hitung Mundur Interview</w:t>
+            </w:r>
+          </w:p>
+        </w:tc>
+        <w:tc>
+          <w:tcPr>
+            <w:tcW w:type="dxa" w:w="6426"/>
+            <w:tcBorders>
+              <w:top w:val="single" w:color="DDD8F0" w:sz="1"/>
+              <w:left w:val="single" w:color="DDD8F0" w:sz="1"/>
+              <w:bottom w:val="single" w:color="DDD8F0" w:sz="1"/>
+              <w:right w:val="single" w:color="DDD8F0" w:sz="1"/>
+            </w:tcBorders>
+            <w:tcMar>
+              <w:top w:type="dxa" w:w="100"/>
+              <w:left w:type="dxa" w:w="140"/>
+              <w:bottom w:type="dxa" w:w="100"/>
+              <w:right w:type="dxa" w:w="140"/>
+            </w:tcMar>
+          </w:tcPr>
+          <w:p>
+            <w:r>
+              <w:rPr>
+                <w:b w:val="false"/>
+                <w:bCs w:val="false"/>
+              </w:rPr>
+              <w:t>Isi tanggal interview aslimu, lalu Talkly menyusun rencana latihan mundur dari hari-H — latihan terarah dari jauh hari, mock interview menjelang hari, review ringan di H-1.</w:t>
+            </w:r>
+          </w:p>
+        </w:tc>
+      </w:tr>
+      <w:tr>
+        <w:tc>
+          <w:tcPr>
+            <w:tcW w:type="dxa" w:w="2600"/>
+            <w:tcBorders>
+              <w:top w:val="single" w:color="DDD8F0" w:sz="1"/>
+              <w:left w:val="single" w:color="DDD8F0" w:sz="1"/>
+              <w:bottom w:val="single" w:color="DDD8F0" w:sz="1"/>
+              <w:right w:val="single" w:color="DDD8F0" w:sz="1"/>
+            </w:tcBorders>
+            <w:tcMar>
+              <w:top w:type="dxa" w:w="100"/>
+              <w:left w:type="dxa" w:w="140"/>
+              <w:bottom w:type="dxa" w:w="100"/>
+              <w:right w:type="dxa" w:w="140"/>
+            </w:tcMar>
+          </w:tcPr>
+          <w:p>
+            <w:r>
+              <w:rPr>
+                <w:b/>
+                <w:bCs/>
+              </w:rPr>
+              <w:t>Grafik Kesiapan</w:t>
+            </w:r>
+          </w:p>
+        </w:tc>
+        <w:tc>
+          <w:tcPr>
+            <w:tcW w:type="dxa" w:w="6426"/>
+            <w:tcBorders>
+              <w:top w:val="single" w:color="DDD8F0" w:sz="1"/>
+              <w:left w:val="single" w:color="DDD8F0" w:sz="1"/>
+              <w:bottom w:val="single" w:color="DDD8F0" w:sz="1"/>
+              <w:right w:val="single" w:color="DDD8F0" w:sz="1"/>
+            </w:tcBorders>
+            <w:tcMar>
+              <w:top w:type="dxa" w:w="100"/>
+              <w:left w:type="dxa" w:w="140"/>
+              <w:bottom w:type="dxa" w:w="100"/>
+              <w:right w:type="dxa" w:w="140"/>
+            </w:tcMar>
+          </w:tcPr>
+          <w:p>
+            <w:r>
+              <w:rPr>
+                <w:b w:val="false"/>
+                <w:bCs w:val="false"/>
+              </w:rPr>
+              <w:t>Lihat skor kesiapanmu naik dari waktu ke waktu dalam bentuk grafik, plus kategori kesalahan yang membaik — jawaban atas pertanyaan “apakah aku makin siap?”</w:t>
+            </w:r>
+          </w:p>
+        </w:tc>
+      </w:tr>
     </w:tbl>
     <w:p>
       <w:pPr>
@@ -687,6 +849,9 @@
       <w:r>
         <w:t xml:space="preserve">Di layar utama pilih Free chat, lalu pilih skenario (misalnya Job interview). Jawab dalam bahasa Inggris senyamanmu — setiap kesalahan muncul di bawah pesanmu beserta versi benarnya dan penjelasannya.</w:t>
       </w:r>
+      <w:r>
+        <w:t xml:space="preserve"> Ingin melatih pengucapan? Ketuk ikon mikrofon untuk menjawab dengan suara.</w:t>
+      </w:r>
     </w:p>
     <w:p>
       <w:pPr>
@@ -726,6 +891,9 @@
       </w:r>
       <w:r>
         <w:t xml:space="preserve">Pilih role yang kamu lamar, jawab 5 pertanyaan seperti interview sungguhan (tanpa interupsi), lalu baca Readiness Report-mu: skor, kelemahan, dan contoh jawaban yang lebih kuat.</w:t>
+      </w:r>
+      <w:r>
+        <w:t xml:space="preserve"> Punya tanggal interview asli? Isi di layar Hitung Mundur, dan Talkly menjadwalkan latihanmu mundur dari hari-H.</w:t>
       </w:r>
     </w:p>
     <w:p>

</xml_diff>

<commit_message>
Guide: add Conversation History + optional name in onboarding
These ship in this release: backend deployed to production (history
endpoints live) and a fresh preview APK is building from current code.

Co-Authored-By: Claude Opus 4.8 <noreply@anthropic.com>
</commit_message>
<xml_diff>
--- a/docs/Talkly-Panduan-Aplikasi.docx
+++ b/docs/Talkly-Panduan-Aplikasi.docx
@@ -756,6 +756,60 @@
           </w:p>
         </w:tc>
       </w:tr>
+      <w:tr>
+        <w:tc>
+          <w:tcPr>
+            <w:tcW w:type="dxa" w:w="2600"/>
+            <w:tcBorders>
+              <w:top w:val="single" w:color="DDD8F0" w:sz="1"/>
+              <w:left w:val="single" w:color="DDD8F0" w:sz="1"/>
+              <w:bottom w:val="single" w:color="DDD8F0" w:sz="1"/>
+              <w:right w:val="single" w:color="DDD8F0" w:sz="1"/>
+            </w:tcBorders>
+            <w:tcMar>
+              <w:top w:type="dxa" w:w="100"/>
+              <w:left w:type="dxa" w:w="140"/>
+              <w:bottom w:type="dxa" w:w="100"/>
+              <w:right w:type="dxa" w:w="140"/>
+            </w:tcMar>
+          </w:tcPr>
+          <w:p>
+            <w:r>
+              <w:rPr>
+                <w:b/>
+                <w:bCs/>
+              </w:rPr>
+              <w:t>Riwayat Percakapan</w:t>
+            </w:r>
+          </w:p>
+        </w:tc>
+        <w:tc>
+          <w:tcPr>
+            <w:tcW w:type="dxa" w:w="6426"/>
+            <w:tcBorders>
+              <w:top w:val="single" w:color="DDD8F0" w:sz="1"/>
+              <w:left w:val="single" w:color="DDD8F0" w:sz="1"/>
+              <w:bottom w:val="single" w:color="DDD8F0" w:sz="1"/>
+              <w:right w:val="single" w:color="DDD8F0" w:sz="1"/>
+            </w:tcBorders>
+            <w:tcMar>
+              <w:top w:type="dxa" w:w="100"/>
+              <w:left w:type="dxa" w:w="140"/>
+              <w:bottom w:type="dxa" w:w="100"/>
+              <w:right w:type="dxa" w:w="140"/>
+            </w:tcMar>
+          </w:tcPr>
+          <w:p>
+            <w:r>
+              <w:rPr>
+                <w:b w:val="false"/>
+                <w:bCs w:val="false"/>
+              </w:rPr>
+              <w:t>Buka kembali sesi latihan lama kapan saja. Semua percakapanmu tersimpan — ketuk satu sesi untuk membaca ulang transkripnya, atau ulangi skenario yang sama.</w:t>
+            </w:r>
+          </w:p>
+        </w:tc>
+      </w:tr>
     </w:tbl>
     <w:p>
       <w:pPr>
@@ -828,6 +882,9 @@
       </w:r>
       <w:r>
         <w:t xml:space="preserve">Sekali saja di awal. AI akan menjelaskan setiap koreksi dalam bahasa ini — misalnya kamu memilih Bahasa Indonesia, maka penjelasan kesalahan ditulis dalam Bahasa Indonesia. Bisa diubah kapan pun di Settings.</w:t>
+      </w:r>
+      <w:r>
+        <w:t xml:space="preserve"> Di layar yang sama, Talkly juga menanyakan namamu (boleh dilewati) agar sapaannya terasa personal.</w:t>
       </w:r>
     </w:p>
     <w:p>

</xml_diff>